<commit_message>
Task #8: Genera manuale d uso BikerLink per utenti
Creato manuale utente BikerLink in due formati:
- manuale-utente-bikerlink.docx (formato Word, richiesto dall utente)
- manuale-utente-bikerlink.md (formato Markdown, reference)

Contenuto completo in italiano con tutte le funzionalita utente:
- Registrazione e login (3 tipi utente, 4 step)
- Schermata principale (mappa, ricerca, counter, SOS)
- Tab Proposte (creazione, categorie, filtri)
- Tab Ride! (disponibilita, SOS, registrazione percorsi)
- Tab Match (matching automatico, garage matching, accetta/rifiuta)
- Tab Pic! (contest settimanale, votazione, hall of fame)
- Tab Chat (messaggi privati/gruppo, condivisione posizione)
- Tab Profilo (modifica, garage/wishlist, foto, statistiche)
- Funzioni speciali (Easter Egg, feedback, eliminazione account)

Esclusi: pannello admin, moderatore, advertisement, branding Syneco.
Installato pacchetto npm docx per la generazione Word.
File .docx presentato all utente con link di download.
</commit_message>
<xml_diff>
--- a/manuale-utente-bikerlink.docx
+++ b/manuale-utente-bikerlink.docx
@@ -188,7 +188,7 @@
     </w:p>
     <w:p>
       <w:pPr>
-        <w:spacing w:after="200"/>
+        <w:spacing w:after="50"/>
         <w:ind w:left="400"/>
       </w:pPr>
       <w:r>
@@ -299,7 +299,7 @@
     </w:p>
     <w:p>
       <w:pPr>
-        <w:spacing w:after="200"/>
+        <w:spacing w:after="50"/>
         <w:ind w:left="400"/>
       </w:pPr>
       <w:r>
@@ -338,19 +338,6 @@
     </w:p>
     <w:p>
       <w:pPr>
-        <w:spacing w:after="100"/>
-      </w:pPr>
-      <w:r>
-        <w:rPr>
-          <w:rFonts w:ascii="Arial" w:cs="Arial" w:eastAsia="Arial" w:hAnsi="Arial"/>
-          <w:sz w:val="22"/>
-          <w:szCs w:val="22"/>
-        </w:rPr>
-        <w:t xml:space="preserve">Dopo la registrazione, accedi con email e password. Se è attiva la verifica email, riceverai un codice di 6 cifre da inserire al primo accesso.</w:t>
-      </w:r>
-    </w:p>
-    <w:p>
-      <w:pPr>
         <w:spacing w:after="200"/>
       </w:pPr>
       <w:r>
@@ -359,7 +346,7 @@
           <w:sz w:val="22"/>
           <w:szCs w:val="22"/>
         </w:rPr>
-        <w:t xml:space="preserve">Se hai dimenticato la password, usa la funzione "Password dimenticata" dalla schermata di login.</w:t>
+        <w:t xml:space="preserve">Dopo la registrazione, accedi con email e password. Se è attiva la verifica email, riceverai un codice di 6 cifre da inserire al primo accesso. Se hai dimenticato la password, usa la funzione "Password dimenticata" dalla schermata di login.</w:t>
       </w:r>
     </w:p>
     <w:p>
@@ -388,7 +375,7 @@
           <w:sz w:val="22"/>
           <w:szCs w:val="22"/>
         </w:rPr>
-        <w:t xml:space="preserve">La schermata principale è il cuore dell'app. Dall'alto verso il basso trovi:</w:t>
+        <w:t xml:space="preserve">La schermata principale è il cuore dell'app.</w:t>
       </w:r>
     </w:p>
     <w:p>
@@ -416,7 +403,7 @@
           <w:sz w:val="22"/>
           <w:szCs w:val="22"/>
         </w:rPr>
-        <w:t xml:space="preserve">In alto trovi il logo BikerLink con l'icona del casco e il pulsante per accedere alla chat. Subito sotto c'è la barra di ricerca: puoi cercare altri utenti per nickname o email. I risultati appaiono immediatamente mentre digiti.</w:t>
+        <w:t xml:space="preserve">In alto trovi il logo BikerLink con l'icona del casco e il pulsante per accedere alla chat. Subito sotto c'è la barra di ricerca: puoi cercare altri utenti per nickname o email.</w:t>
       </w:r>
     </w:p>
     <w:p>
@@ -491,7 +478,7 @@
     </w:p>
     <w:p>
       <w:pPr>
-        <w:spacing w:after="100"/>
+        <w:spacing w:after="50"/>
         <w:ind w:left="400"/>
       </w:pPr>
       <w:r>
@@ -541,7 +528,7 @@
           <w:sz w:val="22"/>
           <w:szCs w:val="22"/>
         </w:rPr>
-        <w:t xml:space="preserve">Sotto la mappa trovi tre contatori che mostrano in tempo reale: Utenti Online, Biker Disponibili e Zavorrine Disponibili. Toccando ciascun contatore si apre la lista completa degli utenti in quella categoria.</w:t>
+        <w:t xml:space="preserve">Sotto la mappa trovi tre contatori che mostrano in tempo reale: Utenti Online, Biker Disponibili e Zavorrine Disponibili. Toccando ciascun contatore si apre la lista completa degli utenti.</w:t>
       </w:r>
     </w:p>
     <w:p>
@@ -637,12 +624,20 @@
       <w:r>
         <w:rPr>
           <w:rFonts w:ascii="Arial" w:cs="Arial" w:eastAsia="Arial" w:hAnsi="Arial"/>
-          <w:b/>
-          <w:bCs/>
-          <w:sz w:val="22"/>
-          <w:szCs w:val="22"/>
-        </w:rPr>
-        <w:t xml:space="preserve">• Giro tra Biker</w:t>
+          <w:sz w:val="22"/>
+          <w:szCs w:val="22"/>
+        </w:rPr>
+        <w:t xml:space="preserve">• </w:t>
+      </w:r>
+      <w:r>
+        <w:rPr>
+          <w:rFonts w:ascii="Arial" w:cs="Arial" w:eastAsia="Arial" w:hAnsi="Arial"/>
+          <w:b/>
+          <w:bCs/>
+          <w:sz w:val="22"/>
+          <w:szCs w:val="22"/>
+        </w:rPr>
+        <w:t xml:space="preserve">Giro tra Biker</w:t>
       </w:r>
       <w:r>
         <w:rPr>
@@ -661,12 +656,20 @@
       <w:r>
         <w:rPr>
           <w:rFonts w:ascii="Arial" w:cs="Arial" w:eastAsia="Arial" w:hAnsi="Arial"/>
-          <w:b/>
-          <w:bCs/>
-          <w:sz w:val="22"/>
-          <w:szCs w:val="22"/>
-        </w:rPr>
-        <w:t xml:space="preserve">• Con Zavorrina</w:t>
+          <w:sz w:val="22"/>
+          <w:szCs w:val="22"/>
+        </w:rPr>
+        <w:t xml:space="preserve">• </w:t>
+      </w:r>
+      <w:r>
+        <w:rPr>
+          <w:rFonts w:ascii="Arial" w:cs="Arial" w:eastAsia="Arial" w:hAnsi="Arial"/>
+          <w:b/>
+          <w:bCs/>
+          <w:sz w:val="22"/>
+          <w:szCs w:val="22"/>
+        </w:rPr>
+        <w:t xml:space="preserve">Con Zavorrina</w:t>
       </w:r>
       <w:r>
         <w:rPr>
@@ -685,12 +688,20 @@
       <w:r>
         <w:rPr>
           <w:rFonts w:ascii="Arial" w:cs="Arial" w:eastAsia="Arial" w:hAnsi="Arial"/>
-          <w:b/>
-          <w:bCs/>
-          <w:sz w:val="22"/>
-          <w:szCs w:val="22"/>
-        </w:rPr>
-        <w:t xml:space="preserve">• Passaggio al Volo</w:t>
+          <w:sz w:val="22"/>
+          <w:szCs w:val="22"/>
+        </w:rPr>
+        <w:t xml:space="preserve">• </w:t>
+      </w:r>
+      <w:r>
+        <w:rPr>
+          <w:rFonts w:ascii="Arial" w:cs="Arial" w:eastAsia="Arial" w:hAnsi="Arial"/>
+          <w:b/>
+          <w:bCs/>
+          <w:sz w:val="22"/>
+          <w:szCs w:val="22"/>
+        </w:rPr>
+        <w:t xml:space="preserve">Passaggio al Volo</w:t>
       </w:r>
       <w:r>
         <w:rPr>
@@ -703,18 +714,26 @@
     </w:p>
     <w:p>
       <w:pPr>
-        <w:spacing w:after="200"/>
-        <w:ind w:left="400"/>
-      </w:pPr>
-      <w:r>
-        <w:rPr>
-          <w:rFonts w:ascii="Arial" w:cs="Arial" w:eastAsia="Arial" w:hAnsi="Arial"/>
-          <w:b/>
-          <w:bCs/>
-          <w:sz w:val="22"/>
-          <w:szCs w:val="22"/>
-        </w:rPr>
-        <w:t xml:space="preserve">• Richieste</w:t>
+        <w:spacing w:after="50"/>
+        <w:ind w:left="400"/>
+      </w:pPr>
+      <w:r>
+        <w:rPr>
+          <w:rFonts w:ascii="Arial" w:cs="Arial" w:eastAsia="Arial" w:hAnsi="Arial"/>
+          <w:sz w:val="22"/>
+          <w:szCs w:val="22"/>
+        </w:rPr>
+        <w:t xml:space="preserve">• </w:t>
+      </w:r>
+      <w:r>
+        <w:rPr>
+          <w:rFonts w:ascii="Arial" w:cs="Arial" w:eastAsia="Arial" w:hAnsi="Arial"/>
+          <w:b/>
+          <w:bCs/>
+          <w:sz w:val="22"/>
+          <w:szCs w:val="22"/>
+        </w:rPr>
+        <w:t xml:space="preserve">Richieste</w:t>
       </w:r>
       <w:r>
         <w:rPr>
@@ -839,16 +858,185 @@
     </w:p>
     <w:p>
       <w:pPr>
+        <w:spacing w:after="50"/>
+        <w:ind w:left="400"/>
+      </w:pPr>
+      <w:r>
+        <w:rPr>
+          <w:rFonts w:ascii="Arial" w:cs="Arial" w:eastAsia="Arial" w:hAnsi="Arial"/>
+          <w:sz w:val="22"/>
+          <w:szCs w:val="22"/>
+        </w:rPr>
+        <w:t xml:space="preserve">• La moto che userai (per i biker, selezionabile dal tuo garage)</w:t>
+      </w:r>
+    </w:p>
+    <w:p>
+      <w:pPr>
+        <w:pStyle w:val="Heading2"/>
+        <w:spacing w:after="100" w:before="200"/>
+      </w:pPr>
+      <w:r>
+        <w:rPr>
+          <w:b/>
+          <w:bCs/>
+          <w:sz w:val="26"/>
+          <w:szCs w:val="26"/>
+        </w:rPr>
+        <w:t xml:space="preserve">4.3 Filtrare le Proposte</w:t>
+      </w:r>
+    </w:p>
+    <w:p>
+      <w:pPr>
+        <w:spacing w:after="100"/>
+      </w:pPr>
+      <w:r>
+        <w:rPr>
+          <w:rFonts w:ascii="Arial" w:cs="Arial" w:eastAsia="Arial" w:hAnsi="Arial"/>
+          <w:sz w:val="22"/>
+          <w:szCs w:val="22"/>
+        </w:rPr>
+        <w:t xml:space="preserve">Puoi filtrare le proposte per trovare più facilmente quelle che ti interessano:</w:t>
+      </w:r>
+    </w:p>
+    <w:p>
+      <w:pPr>
+        <w:spacing w:after="50"/>
+        <w:ind w:left="400"/>
+      </w:pPr>
+      <w:r>
+        <w:rPr>
+          <w:rFonts w:ascii="Arial" w:cs="Arial" w:eastAsia="Arial" w:hAnsi="Arial"/>
+          <w:sz w:val="22"/>
+          <w:szCs w:val="22"/>
+        </w:rPr>
+        <w:t xml:space="preserve">• </w:t>
+      </w:r>
+      <w:r>
+        <w:rPr>
+          <w:rFonts w:ascii="Arial" w:cs="Arial" w:eastAsia="Arial" w:hAnsi="Arial"/>
+          <w:b/>
+          <w:bCs/>
+          <w:sz w:val="22"/>
+          <w:szCs w:val="22"/>
+        </w:rPr>
+        <w:t xml:space="preserve">Per categoria: </w:t>
+      </w:r>
+      <w:r>
+        <w:rPr>
+          <w:rFonts w:ascii="Arial" w:cs="Arial" w:eastAsia="Arial" w:hAnsi="Arial"/>
+          <w:sz w:val="22"/>
+          <w:szCs w:val="22"/>
+        </w:rPr>
+        <w:t xml:space="preserve">Seleziona una delle categorie (Giro tra Biker, Con Zavorrina, Passaggio al Volo, Richieste) per vedere solo quel tipo di proposta.</w:t>
+      </w:r>
+    </w:p>
+    <w:p>
+      <w:pPr>
+        <w:spacing w:after="50"/>
+        <w:ind w:left="400"/>
+      </w:pPr>
+      <w:r>
+        <w:rPr>
+          <w:rFonts w:ascii="Arial" w:cs="Arial" w:eastAsia="Arial" w:hAnsi="Arial"/>
+          <w:sz w:val="22"/>
+          <w:szCs w:val="22"/>
+        </w:rPr>
+        <w:t xml:space="preserve">• </w:t>
+      </w:r>
+      <w:r>
+        <w:rPr>
+          <w:rFonts w:ascii="Arial" w:cs="Arial" w:eastAsia="Arial" w:hAnsi="Arial"/>
+          <w:b/>
+          <w:bCs/>
+          <w:sz w:val="22"/>
+          <w:szCs w:val="22"/>
+        </w:rPr>
+        <w:t xml:space="preserve">Per data: </w:t>
+      </w:r>
+      <w:r>
+        <w:rPr>
+          <w:rFonts w:ascii="Arial" w:cs="Arial" w:eastAsia="Arial" w:hAnsi="Arial"/>
+          <w:sz w:val="22"/>
+          <w:szCs w:val="22"/>
+        </w:rPr>
+        <w:t xml:space="preserve">Filtra per data prevista per trovare giri nel periodo che preferisci.</w:t>
+      </w:r>
+    </w:p>
+    <w:p>
+      <w:pPr>
+        <w:spacing w:after="50"/>
+        <w:ind w:left="400"/>
+      </w:pPr>
+      <w:r>
+        <w:rPr>
+          <w:rFonts w:ascii="Arial" w:cs="Arial" w:eastAsia="Arial" w:hAnsi="Arial"/>
+          <w:sz w:val="22"/>
+          <w:szCs w:val="22"/>
+        </w:rPr>
+        <w:t xml:space="preserve">• </w:t>
+      </w:r>
+      <w:r>
+        <w:rPr>
+          <w:rFonts w:ascii="Arial" w:cs="Arial" w:eastAsia="Arial" w:hAnsi="Arial"/>
+          <w:b/>
+          <w:bCs/>
+          <w:sz w:val="22"/>
+          <w:szCs w:val="22"/>
+        </w:rPr>
+        <w:t xml:space="preserve">Per distanza: </w:t>
+      </w:r>
+      <w:r>
+        <w:rPr>
+          <w:rFonts w:ascii="Arial" w:cs="Arial" w:eastAsia="Arial" w:hAnsi="Arial"/>
+          <w:sz w:val="22"/>
+          <w:szCs w:val="22"/>
+        </w:rPr>
+        <w:t xml:space="preserve">Ordina le proposte in base alla vicinanza dal tuo punto di partenza.</w:t>
+      </w:r>
+    </w:p>
+    <w:p>
+      <w:pPr>
+        <w:spacing w:after="50"/>
+        <w:ind w:left="400"/>
+      </w:pPr>
+      <w:r>
+        <w:rPr>
+          <w:rFonts w:ascii="Arial" w:cs="Arial" w:eastAsia="Arial" w:hAnsi="Arial"/>
+          <w:sz w:val="22"/>
+          <w:szCs w:val="22"/>
+        </w:rPr>
+        <w:t xml:space="preserve">• </w:t>
+      </w:r>
+      <w:r>
+        <w:rPr>
+          <w:rFonts w:ascii="Arial" w:cs="Arial" w:eastAsia="Arial" w:hAnsi="Arial"/>
+          <w:b/>
+          <w:bCs/>
+          <w:sz w:val="22"/>
+          <w:szCs w:val="22"/>
+        </w:rPr>
+        <w:t xml:space="preserve">Per disponibilità: </w:t>
+      </w:r>
+      <w:r>
+        <w:rPr>
+          <w:rFonts w:ascii="Arial" w:cs="Arial" w:eastAsia="Arial" w:hAnsi="Arial"/>
+          <w:sz w:val="22"/>
+          <w:szCs w:val="22"/>
+        </w:rPr>
+        <w:t xml:space="preserve">Visualizza solo le proposte che hanno ancora posti liberi.</w:t>
+      </w:r>
+    </w:p>
+    <w:p>
+      <w:pPr>
         <w:spacing w:after="200"/>
-        <w:ind w:left="400"/>
-      </w:pPr>
-      <w:r>
-        <w:rPr>
-          <w:rFonts w:ascii="Arial" w:cs="Arial" w:eastAsia="Arial" w:hAnsi="Arial"/>
-          <w:sz w:val="22"/>
-          <w:szCs w:val="22"/>
-        </w:rPr>
-        <w:t xml:space="preserve">• La moto che userai (per i biker, selezionabile dal tuo garage)</w:t>
+      </w:pPr>
+      <w:r>
+        <w:rPr>
+          <w:rFonts w:ascii="Arial" w:cs="Arial" w:eastAsia="Arial" w:hAnsi="Arial"/>
+          <w:sz w:val="22"/>
+          <w:szCs w:val="22"/>
+        </w:rPr>
+        <w:t xml:space="preserve">I filtri si combinano tra loro, così puoi restringere la ricerca quanto vuoi.</w:t>
       </w:r>
     </w:p>
     <w:p>
@@ -985,7 +1173,7 @@
     </w:p>
     <w:p>
       <w:pPr>
-        <w:spacing w:after="100"/>
+        <w:spacing w:after="50"/>
         <w:ind w:left="400"/>
       </w:pPr>
       <w:r>
@@ -1027,55 +1215,58 @@
     </w:p>
     <w:p>
       <w:pPr>
-        <w:spacing w:after="100"/>
-      </w:pPr>
-      <w:r>
-        <w:rPr>
-          <w:rFonts w:ascii="Arial" w:cs="Arial" w:eastAsia="Arial" w:hAnsi="Arial"/>
-          <w:sz w:val="22"/>
-          <w:szCs w:val="22"/>
-        </w:rPr>
-        <w:t xml:space="preserve">Dalla schermata Ride! puoi accedere a:</w:t>
-      </w:r>
-    </w:p>
-    <w:p>
-      <w:pPr>
-        <w:spacing w:after="50"/>
-        <w:ind w:left="400"/>
-      </w:pPr>
-      <w:r>
-        <w:rPr>
-          <w:rFonts w:ascii="Arial" w:cs="Arial" w:eastAsia="Arial" w:hAnsi="Arial"/>
-          <w:b/>
-          <w:bCs/>
-          <w:sz w:val="22"/>
-          <w:szCs w:val="22"/>
-        </w:rPr>
-        <w:t xml:space="preserve">• Registra Giro</w:t>
-      </w:r>
-      <w:r>
-        <w:rPr>
-          <w:rFonts w:ascii="Arial" w:cs="Arial" w:eastAsia="Arial" w:hAnsi="Arial"/>
-          <w:sz w:val="22"/>
-          <w:szCs w:val="22"/>
-        </w:rPr>
-        <w:t xml:space="preserve"> — Avvia il tracciamento GPS del tuo percorso. L'app registra distanza, velocità massima, velocità media e altitudine. Il tracciamento si adatta automaticamente alla velocità (autostrada, città, fermo) per risparmiare batteria. Se resti fermo per 10 minuti, ti verrà suggerito di mettere in pausa.</w:t>
-      </w:r>
-    </w:p>
-    <w:p>
-      <w:pPr>
-        <w:spacing w:after="200"/>
-        <w:ind w:left="400"/>
-      </w:pPr>
-      <w:r>
-        <w:rPr>
-          <w:rFonts w:ascii="Arial" w:cs="Arial" w:eastAsia="Arial" w:hAnsi="Arial"/>
-          <w:b/>
-          <w:bCs/>
-          <w:sz w:val="22"/>
-          <w:szCs w:val="22"/>
-        </w:rPr>
-        <w:t xml:space="preserve">• I Miei Percorsi</w:t>
+        <w:spacing w:after="50"/>
+        <w:ind w:left="400"/>
+      </w:pPr>
+      <w:r>
+        <w:rPr>
+          <w:rFonts w:ascii="Arial" w:cs="Arial" w:eastAsia="Arial" w:hAnsi="Arial"/>
+          <w:sz w:val="22"/>
+          <w:szCs w:val="22"/>
+        </w:rPr>
+        <w:t xml:space="preserve">• </w:t>
+      </w:r>
+      <w:r>
+        <w:rPr>
+          <w:rFonts w:ascii="Arial" w:cs="Arial" w:eastAsia="Arial" w:hAnsi="Arial"/>
+          <w:b/>
+          <w:bCs/>
+          <w:sz w:val="22"/>
+          <w:szCs w:val="22"/>
+        </w:rPr>
+        <w:t xml:space="preserve">Registra Giro</w:t>
+      </w:r>
+      <w:r>
+        <w:rPr>
+          <w:rFonts w:ascii="Arial" w:cs="Arial" w:eastAsia="Arial" w:hAnsi="Arial"/>
+          <w:sz w:val="22"/>
+          <w:szCs w:val="22"/>
+        </w:rPr>
+        <w:t xml:space="preserve"> — Avvia il tracciamento GPS del tuo percorso. L'app registra distanza, velocità massima, velocità media e altitudine. Il tracciamento si adatta automaticamente alla velocità per risparmiare batteria. Se resti fermo per 10 minuti, ti verrà suggerito di mettere in pausa.</w:t>
+      </w:r>
+    </w:p>
+    <w:p>
+      <w:pPr>
+        <w:spacing w:after="50"/>
+        <w:ind w:left="400"/>
+      </w:pPr>
+      <w:r>
+        <w:rPr>
+          <w:rFonts w:ascii="Arial" w:cs="Arial" w:eastAsia="Arial" w:hAnsi="Arial"/>
+          <w:sz w:val="22"/>
+          <w:szCs w:val="22"/>
+        </w:rPr>
+        <w:t xml:space="preserve">• </w:t>
+      </w:r>
+      <w:r>
+        <w:rPr>
+          <w:rFonts w:ascii="Arial" w:cs="Arial" w:eastAsia="Arial" w:hAnsi="Arial"/>
+          <w:b/>
+          <w:bCs/>
+          <w:sz w:val="22"/>
+          <w:szCs w:val="22"/>
+        </w:rPr>
+        <w:t xml:space="preserve">I Miei Percorsi</w:t>
       </w:r>
       <w:r>
         <w:rPr>
@@ -1127,7 +1318,7 @@
           <w:sz w:val="22"/>
           <w:szCs w:val="22"/>
         </w:rPr>
-        <w:t xml:space="preserve">Il sistema di matching funziona automaticamente ogni 60 secondi. Confronta le proposte attive e trova combinazioni compatibili basandosi su: tipo di ricerca (chi cerca cosa), distanza tra i punti di partenza, data prevista e sovrapposizione delle fasce orarie. Quando viene trovato un match, entrambi gli utenti ricevono una notifica nella tab Match.</w:t>
+        <w:t xml:space="preserve">Il sistema di matching funziona automaticamente ogni 60 secondi. Confronta le proposte attive e trova combinazioni compatibili basandosi su: tipo di ricerca, distanza tra i punti di partenza, data prevista e sovrapposizione delle fasce orarie. Quando viene trovato un match, entrambi gli utenti ricevono una notifica nella tab Match.</w:t>
       </w:r>
     </w:p>
     <w:p>
@@ -1223,12 +1414,20 @@
       <w:r>
         <w:rPr>
           <w:rFonts w:ascii="Arial" w:cs="Arial" w:eastAsia="Arial" w:hAnsi="Arial"/>
-          <w:b/>
-          <w:bCs/>
-          <w:sz w:val="22"/>
-          <w:szCs w:val="22"/>
-        </w:rPr>
-        <w:t xml:space="preserve">• Galleria: </w:t>
+          <w:sz w:val="22"/>
+          <w:szCs w:val="22"/>
+        </w:rPr>
+        <w:t xml:space="preserve">• </w:t>
+      </w:r>
+      <w:r>
+        <w:rPr>
+          <w:rFonts w:ascii="Arial" w:cs="Arial" w:eastAsia="Arial" w:hAnsi="Arial"/>
+          <w:b/>
+          <w:bCs/>
+          <w:sz w:val="22"/>
+          <w:szCs w:val="22"/>
+        </w:rPr>
+        <w:t xml:space="preserve">Galleria: </w:t>
       </w:r>
       <w:r>
         <w:rPr>
@@ -1247,12 +1446,20 @@
       <w:r>
         <w:rPr>
           <w:rFonts w:ascii="Arial" w:cs="Arial" w:eastAsia="Arial" w:hAnsi="Arial"/>
-          <w:b/>
-          <w:bCs/>
-          <w:sz w:val="22"/>
-          <w:szCs w:val="22"/>
-        </w:rPr>
-        <w:t xml:space="preserve">• Partecipa: </w:t>
+          <w:sz w:val="22"/>
+          <w:szCs w:val="22"/>
+        </w:rPr>
+        <w:t xml:space="preserve">• </w:t>
+      </w:r>
+      <w:r>
+        <w:rPr>
+          <w:rFonts w:ascii="Arial" w:cs="Arial" w:eastAsia="Arial" w:hAnsi="Arial"/>
+          <w:b/>
+          <w:bCs/>
+          <w:sz w:val="22"/>
+          <w:szCs w:val="22"/>
+        </w:rPr>
+        <w:t xml:space="preserve">Partecipa: </w:t>
       </w:r>
       <w:r>
         <w:rPr>
@@ -1271,12 +1478,20 @@
       <w:r>
         <w:rPr>
           <w:rFonts w:ascii="Arial" w:cs="Arial" w:eastAsia="Arial" w:hAnsi="Arial"/>
-          <w:b/>
-          <w:bCs/>
-          <w:sz w:val="22"/>
-          <w:szCs w:val="22"/>
-        </w:rPr>
-        <w:t xml:space="preserve">• Vota: </w:t>
+          <w:sz w:val="22"/>
+          <w:szCs w:val="22"/>
+        </w:rPr>
+        <w:t xml:space="preserve">• </w:t>
+      </w:r>
+      <w:r>
+        <w:rPr>
+          <w:rFonts w:ascii="Arial" w:cs="Arial" w:eastAsia="Arial" w:hAnsi="Arial"/>
+          <w:b/>
+          <w:bCs/>
+          <w:sz w:val="22"/>
+          <w:szCs w:val="22"/>
+        </w:rPr>
+        <w:t xml:space="preserve">Vota: </w:t>
       </w:r>
       <w:r>
         <w:rPr>
@@ -1295,12 +1510,20 @@
       <w:r>
         <w:rPr>
           <w:rFonts w:ascii="Arial" w:cs="Arial" w:eastAsia="Arial" w:hAnsi="Arial"/>
-          <w:b/>
-          <w:bCs/>
-          <w:sz w:val="22"/>
-          <w:szCs w:val="22"/>
-        </w:rPr>
-        <w:t xml:space="preserve">• Performance: </w:t>
+          <w:sz w:val="22"/>
+          <w:szCs w:val="22"/>
+        </w:rPr>
+        <w:t xml:space="preserve">• </w:t>
+      </w:r>
+      <w:r>
+        <w:rPr>
+          <w:rFonts w:ascii="Arial" w:cs="Arial" w:eastAsia="Arial" w:hAnsi="Arial"/>
+          <w:b/>
+          <w:bCs/>
+          <w:sz w:val="22"/>
+          <w:szCs w:val="22"/>
+        </w:rPr>
+        <w:t xml:space="preserve">Performance: </w:t>
       </w:r>
       <w:r>
         <w:rPr>
@@ -1313,18 +1536,26 @@
     </w:p>
     <w:p>
       <w:pPr>
-        <w:spacing w:after="200"/>
-        <w:ind w:left="400"/>
-      </w:pPr>
-      <w:r>
-        <w:rPr>
-          <w:rFonts w:ascii="Arial" w:cs="Arial" w:eastAsia="Arial" w:hAnsi="Arial"/>
-          <w:b/>
-          <w:bCs/>
-          <w:sz w:val="22"/>
-          <w:szCs w:val="22"/>
-        </w:rPr>
-        <w:t xml:space="preserve">• Albo dei Vincitori: </w:t>
+        <w:spacing w:after="50"/>
+        <w:ind w:left="400"/>
+      </w:pPr>
+      <w:r>
+        <w:rPr>
+          <w:rFonts w:ascii="Arial" w:cs="Arial" w:eastAsia="Arial" w:hAnsi="Arial"/>
+          <w:sz w:val="22"/>
+          <w:szCs w:val="22"/>
+        </w:rPr>
+        <w:t xml:space="preserve">• </w:t>
+      </w:r>
+      <w:r>
+        <w:rPr>
+          <w:rFonts w:ascii="Arial" w:cs="Arial" w:eastAsia="Arial" w:hAnsi="Arial"/>
+          <w:b/>
+          <w:bCs/>
+          <w:sz w:val="22"/>
+          <w:szCs w:val="22"/>
+        </w:rPr>
+        <w:t xml:space="preserve">Albo dei Vincitori: </w:t>
       </w:r>
       <w:r>
         <w:rPr>
@@ -1372,12 +1603,20 @@
       <w:r>
         <w:rPr>
           <w:rFonts w:ascii="Arial" w:cs="Arial" w:eastAsia="Arial" w:hAnsi="Arial"/>
-          <w:b/>
-          <w:bCs/>
-          <w:sz w:val="22"/>
-          <w:szCs w:val="22"/>
-        </w:rPr>
-        <w:t xml:space="preserve">• Chat Private: </w:t>
+          <w:sz w:val="22"/>
+          <w:szCs w:val="22"/>
+        </w:rPr>
+        <w:t xml:space="preserve">• </w:t>
+      </w:r>
+      <w:r>
+        <w:rPr>
+          <w:rFonts w:ascii="Arial" w:cs="Arial" w:eastAsia="Arial" w:hAnsi="Arial"/>
+          <w:b/>
+          <w:bCs/>
+          <w:sz w:val="22"/>
+          <w:szCs w:val="22"/>
+        </w:rPr>
+        <w:t xml:space="preserve">Chat Private: </w:t>
       </w:r>
       <w:r>
         <w:rPr>
@@ -1396,12 +1635,20 @@
       <w:r>
         <w:rPr>
           <w:rFonts w:ascii="Arial" w:cs="Arial" w:eastAsia="Arial" w:hAnsi="Arial"/>
-          <w:b/>
-          <w:bCs/>
-          <w:sz w:val="22"/>
-          <w:szCs w:val="22"/>
-        </w:rPr>
-        <w:t xml:space="preserve">• Chat di Gruppo: </w:t>
+          <w:sz w:val="22"/>
+          <w:szCs w:val="22"/>
+        </w:rPr>
+        <w:t xml:space="preserve">• </w:t>
+      </w:r>
+      <w:r>
+        <w:rPr>
+          <w:rFonts w:ascii="Arial" w:cs="Arial" w:eastAsia="Arial" w:hAnsi="Arial"/>
+          <w:b/>
+          <w:bCs/>
+          <w:sz w:val="22"/>
+          <w:szCs w:val="22"/>
+        </w:rPr>
+        <w:t xml:space="preserve">Chat di Gruppo: </w:t>
       </w:r>
       <w:r>
         <w:rPr>
@@ -1414,18 +1661,26 @@
     </w:p>
     <w:p>
       <w:pPr>
-        <w:spacing w:after="100"/>
-        <w:ind w:left="400"/>
-      </w:pPr>
-      <w:r>
-        <w:rPr>
-          <w:rFonts w:ascii="Arial" w:cs="Arial" w:eastAsia="Arial" w:hAnsi="Arial"/>
-          <w:b/>
-          <w:bCs/>
-          <w:sz w:val="22"/>
-          <w:szCs w:val="22"/>
-        </w:rPr>
-        <w:t xml:space="preserve">• Messaggi: </w:t>
+        <w:spacing w:after="50"/>
+        <w:ind w:left="400"/>
+      </w:pPr>
+      <w:r>
+        <w:rPr>
+          <w:rFonts w:ascii="Arial" w:cs="Arial" w:eastAsia="Arial" w:hAnsi="Arial"/>
+          <w:sz w:val="22"/>
+          <w:szCs w:val="22"/>
+        </w:rPr>
+        <w:t xml:space="preserve">• </w:t>
+      </w:r>
+      <w:r>
+        <w:rPr>
+          <w:rFonts w:ascii="Arial" w:cs="Arial" w:eastAsia="Arial" w:hAnsi="Arial"/>
+          <w:b/>
+          <w:bCs/>
+          <w:sz w:val="22"/>
+          <w:szCs w:val="22"/>
+        </w:rPr>
+        <w:t xml:space="preserve">Messaggi: </w:t>
       </w:r>
       <w:r>
         <w:rPr>
@@ -1595,7 +1850,7 @@
     </w:p>
     <w:p>
       <w:pPr>
-        <w:spacing w:after="200"/>
+        <w:spacing w:after="50"/>
         <w:ind w:left="400"/>
       </w:pPr>
       <w:r>

</xml_diff>